<commit_message>
update task of DOC
</commit_message>
<xml_diff>
--- a/DOC/1_ApplicationDevelopment_First Plan.docx
+++ b/DOC/1_ApplicationDevelopment_First Plan.docx
@@ -961,6 +961,15 @@
                 <w:szCs w:val="26"/>
               </w:rPr>
             </w:pPr>
+            <w:r>
+              <w:rPr>
+                <w:rFonts w:ascii="Times New Roman" w:hAnsi="Times New Roman" w:cs="Times New Roman"/>
+                <w:bCs/>
+                <w:sz w:val="26"/>
+                <w:szCs w:val="26"/>
+              </w:rPr>
+              <w:t>Trần Quốc Tây</w:t>
+            </w:r>
           </w:p>
         </w:tc>
         <w:tc>
@@ -1251,6 +1260,15 @@
                 <w:szCs w:val="26"/>
               </w:rPr>
             </w:pPr>
+            <w:r>
+              <w:rPr>
+                <w:rFonts w:ascii="Times New Roman" w:hAnsi="Times New Roman" w:cs="Times New Roman"/>
+                <w:bCs/>
+                <w:sz w:val="26"/>
+                <w:szCs w:val="26"/>
+              </w:rPr>
+              <w:t>Trần Thành Danh</w:t>
+            </w:r>
           </w:p>
         </w:tc>
         <w:tc>
@@ -8558,7 +8576,6 @@
     <w:p>
       <w:pPr>
         <w:spacing w:after="120" w:line="240" w:lineRule="auto"/>
-        <w:jc w:val="both"/>
         <w:rPr>
           <w:rFonts w:ascii="Times New Roman" w:hAnsi="Times New Roman" w:cs="Times New Roman"/>
           <w:sz w:val="26"/>
@@ -8571,7 +8588,62 @@
           <w:sz w:val="26"/>
           <w:szCs w:val="26"/>
         </w:rPr>
-        <w:t>Link nhật ký (</w:t>
+        <w:t>Link nhật ký</w:t>
+      </w:r>
+      <w:r>
+        <w:rPr>
+          <w:rFonts w:ascii="Times New Roman" w:hAnsi="Times New Roman" w:cs="Times New Roman"/>
+          <w:sz w:val="26"/>
+          <w:szCs w:val="26"/>
+        </w:rPr>
+        <w:t xml:space="preserve">: </w:t>
+      </w:r>
+      <w:hyperlink r:id="rId7" w:history="1">
+        <w:r>
+          <w:rPr>
+            <w:rStyle w:val="Hyperlink"/>
+            <w:rFonts w:ascii="Times New Roman" w:hAnsi="Times New Roman" w:cs="Times New Roman"/>
+            <w:sz w:val="26"/>
+            <w:szCs w:val="26"/>
+          </w:rPr>
+          <w:t>QuanLy</w:t>
+        </w:r>
+        <w:r>
+          <w:rPr>
+            <w:rStyle w:val="Hyperlink"/>
+            <w:rFonts w:ascii="Times New Roman" w:hAnsi="Times New Roman" w:cs="Times New Roman"/>
+            <w:sz w:val="26"/>
+            <w:szCs w:val="26"/>
+          </w:rPr>
+          <w:t>CuaHang</w:t>
+        </w:r>
+        <w:r>
+          <w:rPr>
+            <w:rStyle w:val="Hyperlink"/>
+            <w:rFonts w:ascii="Times New Roman" w:hAnsi="Times New Roman" w:cs="Times New Roman"/>
+            <w:sz w:val="26"/>
+            <w:szCs w:val="26"/>
+          </w:rPr>
+          <w:t>ThuCung</w:t>
+        </w:r>
+      </w:hyperlink>
+    </w:p>
+    <w:p>
+      <w:pPr>
+        <w:spacing w:after="120" w:line="240" w:lineRule="auto"/>
+        <w:rPr>
+          <w:rFonts w:ascii="Times New Roman" w:hAnsi="Times New Roman" w:cs="Times New Roman"/>
+          <w:sz w:val="26"/>
+          <w:szCs w:val="26"/>
+        </w:rPr>
+      </w:pPr>
+      <w:r>
+        <w:rPr>
+          <w:rFonts w:ascii="Times New Roman" w:hAnsi="Times New Roman" w:cs="Times New Roman"/>
+          <w:sz w:val="26"/>
+          <w:szCs w:val="26"/>
+        </w:rPr>
+        <w:t>(</w:t>
       </w:r>
       <w:r>
         <w:rPr>
@@ -8591,7 +8663,7 @@
       </w:r>
     </w:p>
     <w:sectPr>
-      <w:footerReference w:type="default" r:id="rId7"/>
+      <w:footerReference w:type="default" r:id="rId8"/>
       <w:pgSz w:w="12240" w:h="15840" w:code="1"/>
       <w:pgMar w:top="851" w:right="851" w:bottom="851" w:left="1134" w:header="567" w:footer="567" w:gutter="0"/>
       <w:cols w:space="720"/>
@@ -9528,6 +9600,29 @@
     <w:uiPriority w:val="99"/>
     <w:rsid w:val="0007450D"/>
   </w:style>
+  <w:style w:type="character" w:styleId="Hyperlink">
+    <w:name w:val="Hyperlink"/>
+    <w:basedOn w:val="DefaultParagraphFont"/>
+    <w:uiPriority w:val="99"/>
+    <w:unhideWhenUsed/>
+    <w:rsid w:val="00FD122B"/>
+    <w:rPr>
+      <w:color w:val="0563C1" w:themeColor="hyperlink"/>
+      <w:u w:val="single"/>
+    </w:rPr>
+  </w:style>
+  <w:style w:type="character" w:styleId="UnresolvedMention">
+    <w:name w:val="Unresolved Mention"/>
+    <w:basedOn w:val="DefaultParagraphFont"/>
+    <w:uiPriority w:val="99"/>
+    <w:semiHidden/>
+    <w:unhideWhenUsed/>
+    <w:rsid w:val="00FD122B"/>
+    <w:rPr>
+      <w:color w:val="605E5C"/>
+      <w:shd w:val="clear" w:color="auto" w:fill="E1DFDD"/>
+    </w:rPr>
+  </w:style>
 </w:styles>
 </file>
 

</xml_diff>

<commit_message>
add file docs week 2
</commit_message>
<xml_diff>
--- a/DOC/1_ApplicationDevelopment_First Plan.docx
+++ b/DOC/1_ApplicationDevelopment_First Plan.docx
@@ -714,39 +714,15 @@
                 <w:sz w:val="26"/>
                 <w:szCs w:val="26"/>
               </w:rPr>
-              <w:t>10</w:t>
-            </w:r>
-            <w:r>
-              <w:rPr>
-                <w:rFonts w:ascii="Times New Roman" w:hAnsi="Times New Roman" w:cs="Times New Roman"/>
-                <w:sz w:val="26"/>
-                <w:szCs w:val="26"/>
-              </w:rPr>
-              <w:t>/</w:t>
-            </w:r>
-            <w:r>
-              <w:rPr>
-                <w:rFonts w:ascii="Times New Roman" w:hAnsi="Times New Roman" w:cs="Times New Roman"/>
-                <w:sz w:val="26"/>
-                <w:szCs w:val="26"/>
-              </w:rPr>
-              <w:t>08</w:t>
-            </w:r>
-            <w:r>
-              <w:rPr>
-                <w:rFonts w:ascii="Times New Roman" w:hAnsi="Times New Roman" w:cs="Times New Roman"/>
-                <w:sz w:val="26"/>
-                <w:szCs w:val="26"/>
-              </w:rPr>
-              <w:t>/20</w:t>
-            </w:r>
-            <w:r>
-              <w:rPr>
-                <w:rFonts w:ascii="Times New Roman" w:hAnsi="Times New Roman" w:cs="Times New Roman"/>
-                <w:sz w:val="26"/>
-                <w:szCs w:val="26"/>
-              </w:rPr>
-              <w:t>26</w:t>
+              <w:t>03</w:t>
+            </w:r>
+            <w:r>
+              <w:rPr>
+                <w:rFonts w:ascii="Times New Roman" w:hAnsi="Times New Roman" w:cs="Times New Roman"/>
+                <w:sz w:val="26"/>
+                <w:szCs w:val="26"/>
+              </w:rPr>
+              <w:t>/08/2026</w:t>
             </w:r>
           </w:p>
           <w:p>
@@ -772,39 +748,15 @@
                 <w:sz w:val="26"/>
                 <w:szCs w:val="26"/>
               </w:rPr>
-              <w:t>16</w:t>
-            </w:r>
-            <w:r>
-              <w:rPr>
-                <w:rFonts w:ascii="Times New Roman" w:hAnsi="Times New Roman" w:cs="Times New Roman"/>
-                <w:sz w:val="26"/>
-                <w:szCs w:val="26"/>
-              </w:rPr>
-              <w:t>/</w:t>
-            </w:r>
-            <w:r>
-              <w:rPr>
-                <w:rFonts w:ascii="Times New Roman" w:hAnsi="Times New Roman" w:cs="Times New Roman"/>
-                <w:sz w:val="26"/>
-                <w:szCs w:val="26"/>
-              </w:rPr>
-              <w:t>08</w:t>
-            </w:r>
-            <w:r>
-              <w:rPr>
-                <w:rFonts w:ascii="Times New Roman" w:hAnsi="Times New Roman" w:cs="Times New Roman"/>
-                <w:sz w:val="26"/>
-                <w:szCs w:val="26"/>
-              </w:rPr>
-              <w:t>/20</w:t>
-            </w:r>
-            <w:r>
-              <w:rPr>
-                <w:rFonts w:ascii="Times New Roman" w:hAnsi="Times New Roman" w:cs="Times New Roman"/>
-                <w:sz w:val="26"/>
-                <w:szCs w:val="26"/>
-              </w:rPr>
-              <w:t>26</w:t>
+              <w:t>09</w:t>
+            </w:r>
+            <w:r>
+              <w:rPr>
+                <w:rFonts w:ascii="Times New Roman" w:hAnsi="Times New Roman" w:cs="Times New Roman"/>
+                <w:sz w:val="26"/>
+                <w:szCs w:val="26"/>
+              </w:rPr>
+              <w:t>/08/2026</w:t>
             </w:r>
             <w:r>
               <w:rPr>
@@ -836,11 +788,9 @@
             <w:r>
               <w:rPr>
                 <w:rFonts w:ascii="Times New Roman" w:hAnsi="Times New Roman" w:cs="Times New Roman"/>
-                <w:bCs/>
-                <w:sz w:val="26"/>
-                <w:szCs w:val="26"/>
-              </w:rPr>
-              <w:t>Khảo sát hiện trạng</w:t>
+                <w:sz w:val="26"/>
+              </w:rPr>
+              <w:t>1. Đăng ký nhóm, GV gán đồ án</w:t>
             </w:r>
           </w:p>
         </w:tc>
@@ -935,40 +885,38 @@
             <w:r>
               <w:rPr>
                 <w:rFonts w:ascii="Times New Roman" w:hAnsi="Times New Roman" w:cs="Times New Roman"/>
+                <w:sz w:val="26"/>
+              </w:rPr>
+              <w:t xml:space="preserve">2. Lên kế hoạch ban đầu thực hiện </w:t>
+            </w:r>
+          </w:p>
+        </w:tc>
+        <w:tc>
+          <w:tcPr>
+            <w:tcW w:w="1257" w:type="pct"/>
+            <w:tcBorders>
+              <w:top w:val="dotted" w:sz="4" w:space="0" w:color="auto"/>
+              <w:bottom w:val="dotted" w:sz="4" w:space="0" w:color="auto"/>
+            </w:tcBorders>
+            <w:vAlign w:val="center"/>
+          </w:tcPr>
+          <w:p>
+            <w:pPr>
+              <w:rPr>
+                <w:rFonts w:ascii="Times New Roman" w:hAnsi="Times New Roman" w:cs="Times New Roman"/>
                 <w:bCs/>
                 <w:sz w:val="26"/>
                 <w:szCs w:val="26"/>
               </w:rPr>
-              <w:t>Khảo sát quy trình nghiệp vụ</w:t>
-            </w:r>
-          </w:p>
-        </w:tc>
-        <w:tc>
-          <w:tcPr>
-            <w:tcW w:w="1257" w:type="pct"/>
-            <w:tcBorders>
-              <w:top w:val="dotted" w:sz="4" w:space="0" w:color="auto"/>
-              <w:bottom w:val="dotted" w:sz="4" w:space="0" w:color="auto"/>
-            </w:tcBorders>
-            <w:vAlign w:val="center"/>
-          </w:tcPr>
-          <w:p>
-            <w:pPr>
+            </w:pPr>
+            <w:r>
               <w:rPr>
                 <w:rFonts w:ascii="Times New Roman" w:hAnsi="Times New Roman" w:cs="Times New Roman"/>
                 <w:bCs/>
                 <w:sz w:val="26"/>
                 <w:szCs w:val="26"/>
               </w:rPr>
-            </w:pPr>
-            <w:r>
-              <w:rPr>
-                <w:rFonts w:ascii="Times New Roman" w:hAnsi="Times New Roman" w:cs="Times New Roman"/>
-                <w:bCs/>
-                <w:sz w:val="26"/>
-                <w:szCs w:val="26"/>
-              </w:rPr>
-              <w:t>Trần Quốc Tây</w:t>
+              <w:t>Cả nhóm</w:t>
             </w:r>
           </w:p>
         </w:tc>
@@ -990,6 +938,16 @@
                 <w:szCs w:val="26"/>
               </w:rPr>
             </w:pPr>
+            <w:r>
+              <w:rPr>
+                <w:rFonts w:ascii="Times New Roman" w:hAnsi="Times New Roman" w:cs="Times New Roman"/>
+                <w:i/>
+                <w:color w:val="FF0000"/>
+                <w:sz w:val="26"/>
+                <w:szCs w:val="26"/>
+              </w:rPr>
+              <w:t>Họp nhóm 20h ngày 10/08 để cùng phân chia công việc.</w:t>
+            </w:r>
           </w:p>
         </w:tc>
       </w:tr>
@@ -1035,40 +993,55 @@
             <w:r>
               <w:rPr>
                 <w:rFonts w:ascii="Times New Roman" w:hAnsi="Times New Roman" w:cs="Times New Roman"/>
+                <w:sz w:val="26"/>
+              </w:rPr>
+              <w:t>3. Phân chia công việc nhóm (</w:t>
+            </w:r>
+            <w:hyperlink r:id="rId7" w:history="1">
+              <w:r>
+                <w:rPr>
+                  <w:rStyle w:val="Hyperlink"/>
+                  <w:rFonts w:ascii="Times New Roman" w:hAnsi="Times New Roman" w:cs="Times New Roman"/>
+                  <w:sz w:val="26"/>
+                </w:rPr>
+                <w:t>Bảng phân công</w:t>
+              </w:r>
+            </w:hyperlink>
+            <w:r>
+              <w:rPr>
+                <w:rFonts w:ascii="Times New Roman" w:hAnsi="Times New Roman" w:cs="Times New Roman"/>
+                <w:sz w:val="26"/>
+              </w:rPr>
+              <w:t>)</w:t>
+            </w:r>
+          </w:p>
+        </w:tc>
+        <w:tc>
+          <w:tcPr>
+            <w:tcW w:w="1257" w:type="pct"/>
+            <w:tcBorders>
+              <w:top w:val="dotted" w:sz="4" w:space="0" w:color="auto"/>
+              <w:bottom w:val="dotted" w:sz="4" w:space="0" w:color="auto"/>
+            </w:tcBorders>
+            <w:vAlign w:val="center"/>
+          </w:tcPr>
+          <w:p>
+            <w:pPr>
+              <w:rPr>
+                <w:rFonts w:ascii="Times New Roman" w:hAnsi="Times New Roman" w:cs="Times New Roman"/>
                 <w:bCs/>
                 <w:sz w:val="26"/>
                 <w:szCs w:val="26"/>
               </w:rPr>
-              <w:t>Khảo sát quy định</w:t>
-            </w:r>
-          </w:p>
-        </w:tc>
-        <w:tc>
-          <w:tcPr>
-            <w:tcW w:w="1257" w:type="pct"/>
-            <w:tcBorders>
-              <w:top w:val="dotted" w:sz="4" w:space="0" w:color="auto"/>
-              <w:bottom w:val="dotted" w:sz="4" w:space="0" w:color="auto"/>
-            </w:tcBorders>
-            <w:vAlign w:val="center"/>
-          </w:tcPr>
-          <w:p>
-            <w:pPr>
+            </w:pPr>
+            <w:r>
               <w:rPr>
                 <w:rFonts w:ascii="Times New Roman" w:hAnsi="Times New Roman" w:cs="Times New Roman"/>
                 <w:bCs/>
                 <w:sz w:val="26"/>
                 <w:szCs w:val="26"/>
               </w:rPr>
-            </w:pPr>
-            <w:r>
-              <w:rPr>
-                <w:rFonts w:ascii="Times New Roman" w:hAnsi="Times New Roman" w:cs="Times New Roman"/>
-                <w:bCs/>
-                <w:sz w:val="26"/>
-                <w:szCs w:val="26"/>
-              </w:rPr>
-              <w:t>Phan Nhựt Tân</w:t>
+              <w:t>Trần Thu Ngân</w:t>
             </w:r>
           </w:p>
         </w:tc>
@@ -1135,40 +1108,38 @@
             <w:r>
               <w:rPr>
                 <w:rFonts w:ascii="Times New Roman" w:hAnsi="Times New Roman" w:cs="Times New Roman"/>
+                <w:sz w:val="26"/>
+              </w:rPr>
+              <w:t xml:space="preserve">4. Tìm hiểu các hệ thống tương tự </w:t>
+            </w:r>
+          </w:p>
+        </w:tc>
+        <w:tc>
+          <w:tcPr>
+            <w:tcW w:w="1257" w:type="pct"/>
+            <w:tcBorders>
+              <w:top w:val="dotted" w:sz="4" w:space="0" w:color="auto"/>
+              <w:bottom w:val="dotted" w:sz="4" w:space="0" w:color="auto"/>
+            </w:tcBorders>
+            <w:vAlign w:val="center"/>
+          </w:tcPr>
+          <w:p>
+            <w:pPr>
+              <w:rPr>
+                <w:rFonts w:ascii="Times New Roman" w:hAnsi="Times New Roman" w:cs="Times New Roman"/>
                 <w:bCs/>
                 <w:sz w:val="26"/>
                 <w:szCs w:val="26"/>
               </w:rPr>
-              <w:t>Khảo sát yêu cầu chức năng/phi chức năng</w:t>
-            </w:r>
-          </w:p>
-        </w:tc>
-        <w:tc>
-          <w:tcPr>
-            <w:tcW w:w="1257" w:type="pct"/>
-            <w:tcBorders>
-              <w:top w:val="dotted" w:sz="4" w:space="0" w:color="auto"/>
-              <w:bottom w:val="dotted" w:sz="4" w:space="0" w:color="auto"/>
-            </w:tcBorders>
-            <w:vAlign w:val="center"/>
-          </w:tcPr>
-          <w:p>
-            <w:pPr>
+            </w:pPr>
+            <w:r>
               <w:rPr>
                 <w:rFonts w:ascii="Times New Roman" w:hAnsi="Times New Roman" w:cs="Times New Roman"/>
                 <w:bCs/>
                 <w:sz w:val="26"/>
                 <w:szCs w:val="26"/>
               </w:rPr>
-            </w:pPr>
-            <w:r>
-              <w:rPr>
-                <w:rFonts w:ascii="Times New Roman" w:hAnsi="Times New Roman" w:cs="Times New Roman"/>
-                <w:bCs/>
-                <w:sz w:val="26"/>
-                <w:szCs w:val="26"/>
-              </w:rPr>
-              <w:t>Trần Tiến Danh</w:t>
+              <w:t>Cả nhóm</w:t>
             </w:r>
           </w:p>
         </w:tc>
@@ -1231,44 +1202,26 @@
                 <w:szCs w:val="26"/>
               </w:rPr>
             </w:pPr>
-            <w:r>
+          </w:p>
+        </w:tc>
+        <w:tc>
+          <w:tcPr>
+            <w:tcW w:w="1257" w:type="pct"/>
+            <w:tcBorders>
+              <w:top w:val="dotted" w:sz="4" w:space="0" w:color="auto"/>
+              <w:bottom w:val="single" w:sz="4" w:space="0" w:color="auto"/>
+            </w:tcBorders>
+            <w:vAlign w:val="center"/>
+          </w:tcPr>
+          <w:p>
+            <w:pPr>
               <w:rPr>
                 <w:rFonts w:ascii="Times New Roman" w:hAnsi="Times New Roman" w:cs="Times New Roman"/>
                 <w:bCs/>
                 <w:sz w:val="26"/>
                 <w:szCs w:val="26"/>
               </w:rPr>
-              <w:t>Sơ đồ phân cấp chức năng</w:t>
-            </w:r>
-          </w:p>
-        </w:tc>
-        <w:tc>
-          <w:tcPr>
-            <w:tcW w:w="1257" w:type="pct"/>
-            <w:tcBorders>
-              <w:top w:val="dotted" w:sz="4" w:space="0" w:color="auto"/>
-              <w:bottom w:val="single" w:sz="4" w:space="0" w:color="auto"/>
-            </w:tcBorders>
-            <w:vAlign w:val="center"/>
-          </w:tcPr>
-          <w:p>
-            <w:pPr>
-              <w:rPr>
-                <w:rFonts w:ascii="Times New Roman" w:hAnsi="Times New Roman" w:cs="Times New Roman"/>
-                <w:bCs/>
-                <w:sz w:val="26"/>
-                <w:szCs w:val="26"/>
-              </w:rPr>
-            </w:pPr>
-            <w:r>
-              <w:rPr>
-                <w:rFonts w:ascii="Times New Roman" w:hAnsi="Times New Roman" w:cs="Times New Roman"/>
-                <w:bCs/>
-                <w:sz w:val="26"/>
-                <w:szCs w:val="26"/>
-              </w:rPr>
-              <w:t>Trần Thành Danh</w:t>
-            </w:r>
+            </w:pPr>
           </w:p>
         </w:tc>
         <w:tc>
@@ -1349,47 +1302,7 @@
                 <w:sz w:val="26"/>
                 <w:szCs w:val="26"/>
               </w:rPr>
-              <w:t xml:space="preserve">:  </w:t>
-            </w:r>
-            <w:r>
-              <w:rPr>
-                <w:rFonts w:ascii="Times New Roman" w:hAnsi="Times New Roman" w:cs="Times New Roman"/>
-                <w:sz w:val="26"/>
-                <w:szCs w:val="26"/>
-              </w:rPr>
-              <w:t>17</w:t>
-            </w:r>
-            <w:r>
-              <w:rPr>
-                <w:rFonts w:ascii="Times New Roman" w:hAnsi="Times New Roman" w:cs="Times New Roman"/>
-                <w:sz w:val="26"/>
-                <w:szCs w:val="26"/>
-              </w:rPr>
-              <w:t>/</w:t>
-            </w:r>
-            <w:r>
-              <w:rPr>
-                <w:rFonts w:ascii="Times New Roman" w:hAnsi="Times New Roman" w:cs="Times New Roman"/>
-                <w:sz w:val="26"/>
-                <w:szCs w:val="26"/>
-              </w:rPr>
-              <w:t>08</w:t>
-            </w:r>
-            <w:r>
-              <w:rPr>
-                <w:rFonts w:ascii="Times New Roman" w:hAnsi="Times New Roman" w:cs="Times New Roman"/>
-                <w:sz w:val="26"/>
-                <w:szCs w:val="26"/>
-              </w:rPr>
-              <w:t>/20</w:t>
-            </w:r>
-            <w:r>
-              <w:rPr>
-                <w:rFonts w:ascii="Times New Roman" w:hAnsi="Times New Roman" w:cs="Times New Roman"/>
-                <w:sz w:val="26"/>
-                <w:szCs w:val="26"/>
-              </w:rPr>
-              <w:t>26</w:t>
+              <w:t>:  10/08/2026</w:t>
             </w:r>
           </w:p>
           <w:p>
@@ -1414,48 +1327,25 @@
                 <w:sz w:val="26"/>
                 <w:szCs w:val="26"/>
               </w:rPr>
-              <w:t>23</w:t>
-            </w:r>
-            <w:r>
-              <w:rPr>
-                <w:rFonts w:ascii="Times New Roman" w:hAnsi="Times New Roman" w:cs="Times New Roman"/>
-                <w:sz w:val="26"/>
-                <w:szCs w:val="26"/>
-              </w:rPr>
-              <w:t>/</w:t>
-            </w:r>
-            <w:r>
-              <w:rPr>
-                <w:rFonts w:ascii="Times New Roman" w:hAnsi="Times New Roman" w:cs="Times New Roman"/>
-                <w:sz w:val="26"/>
-                <w:szCs w:val="26"/>
-              </w:rPr>
-              <w:t>08</w:t>
-            </w:r>
-            <w:r>
-              <w:rPr>
-                <w:rFonts w:ascii="Times New Roman" w:hAnsi="Times New Roman" w:cs="Times New Roman"/>
-                <w:sz w:val="26"/>
-                <w:szCs w:val="26"/>
-              </w:rPr>
-              <w:t>/20</w:t>
-            </w:r>
-            <w:r>
-              <w:rPr>
-                <w:rFonts w:ascii="Times New Roman" w:hAnsi="Times New Roman" w:cs="Times New Roman"/>
-                <w:sz w:val="26"/>
-                <w:szCs w:val="26"/>
-              </w:rPr>
-              <w:t>26</w:t>
-            </w:r>
-            <w:r>
-              <w:rPr>
-                <w:rFonts w:ascii="Times New Roman" w:hAnsi="Times New Roman" w:cs="Times New Roman"/>
-                <w:sz w:val="26"/>
-                <w:szCs w:val="26"/>
-              </w:rPr>
-              <w:t>)</w:t>
-            </w:r>
+              <w:t>16/08/2026</w:t>
+            </w:r>
+            <w:r>
+              <w:rPr>
+                <w:rFonts w:ascii="Times New Roman" w:hAnsi="Times New Roman" w:cs="Times New Roman"/>
+                <w:sz w:val="26"/>
+                <w:szCs w:val="26"/>
+              </w:rPr>
+              <w:t xml:space="preserve">) </w:t>
+            </w:r>
+          </w:p>
+          <w:p>
+            <w:pPr>
+              <w:rPr>
+                <w:rFonts w:ascii="Times New Roman" w:hAnsi="Times New Roman" w:cs="Times New Roman"/>
+                <w:sz w:val="26"/>
+                <w:szCs w:val="26"/>
+              </w:rPr>
+            </w:pPr>
           </w:p>
         </w:tc>
         <w:tc>
@@ -1474,6 +1364,43 @@
                 <w:szCs w:val="26"/>
               </w:rPr>
             </w:pPr>
+            <w:r>
+              <w:rPr>
+                <w:rFonts w:ascii="Times New Roman" w:hAnsi="Times New Roman" w:cs="Times New Roman"/>
+                <w:sz w:val="26"/>
+              </w:rPr>
+              <w:t xml:space="preserve">1. </w:t>
+            </w:r>
+            <w:r>
+              <w:rPr>
+                <w:rFonts w:ascii="Times New Roman" w:hAnsi="Times New Roman" w:cs="Times New Roman"/>
+                <w:bCs/>
+                <w:iCs/>
+                <w:sz w:val="26"/>
+              </w:rPr>
+              <w:t>Phân tích yêu cầu</w:t>
+            </w:r>
+            <w:r>
+              <w:rPr>
+                <w:rFonts w:ascii="Times New Roman" w:hAnsi="Times New Roman" w:cs="Times New Roman"/>
+                <w:sz w:val="26"/>
+              </w:rPr>
+              <w:t xml:space="preserve"> của đồ án. Làm rõ các yêu cầu của đồ án</w:t>
+            </w:r>
+            <w:r>
+              <w:rPr>
+                <w:rFonts w:ascii="Times New Roman" w:hAnsi="Times New Roman" w:cs="Times New Roman"/>
+                <w:sz w:val="26"/>
+              </w:rPr>
+              <w:t xml:space="preserve"> dựa trên bảng phân công ở tuần 1</w:t>
+            </w:r>
+            <w:r>
+              <w:rPr>
+                <w:rFonts w:ascii="Times New Roman" w:hAnsi="Times New Roman" w:cs="Times New Roman"/>
+                <w:sz w:val="26"/>
+              </w:rPr>
+              <w:t xml:space="preserve"> (đặt/trả lời các câu hỏi liên quan).</w:t>
+            </w:r>
           </w:p>
         </w:tc>
         <w:tc>
@@ -1492,6 +1419,14 @@
                 <w:szCs w:val="26"/>
               </w:rPr>
             </w:pPr>
+            <w:r>
+              <w:rPr>
+                <w:rFonts w:ascii="Times New Roman" w:hAnsi="Times New Roman" w:cs="Times New Roman"/>
+                <w:sz w:val="26"/>
+                <w:szCs w:val="26"/>
+              </w:rPr>
+              <w:t>Cả nhóm</w:t>
+            </w:r>
           </w:p>
         </w:tc>
         <w:tc>
@@ -1550,6 +1485,13 @@
                 <w:szCs w:val="26"/>
               </w:rPr>
             </w:pPr>
+            <w:r>
+              <w:rPr>
+                <w:rFonts w:ascii="Times New Roman" w:hAnsi="Times New Roman" w:cs="Times New Roman"/>
+                <w:sz w:val="26"/>
+              </w:rPr>
+              <w:t>2. Giới hạn mục tiêu của đồ án.</w:t>
+            </w:r>
           </w:p>
         </w:tc>
         <w:tc>
@@ -1559,16 +1501,23 @@
               <w:top w:val="dotted" w:sz="4" w:space="0" w:color="auto"/>
               <w:bottom w:val="dotted" w:sz="4" w:space="0" w:color="auto"/>
             </w:tcBorders>
-            <w:vAlign w:val="center"/>
-          </w:tcPr>
-          <w:p>
-            <w:pPr>
-              <w:rPr>
-                <w:rFonts w:ascii="Times New Roman" w:hAnsi="Times New Roman" w:cs="Times New Roman"/>
-                <w:sz w:val="26"/>
-                <w:szCs w:val="26"/>
-              </w:rPr>
-            </w:pPr>
+          </w:tcPr>
+          <w:p>
+            <w:pPr>
+              <w:rPr>
+                <w:rFonts w:ascii="Times New Roman" w:hAnsi="Times New Roman" w:cs="Times New Roman"/>
+                <w:sz w:val="26"/>
+                <w:szCs w:val="26"/>
+              </w:rPr>
+            </w:pPr>
+            <w:r>
+              <w:rPr>
+                <w:rFonts w:ascii="Times New Roman" w:hAnsi="Times New Roman" w:cs="Times New Roman"/>
+                <w:sz w:val="26"/>
+                <w:szCs w:val="26"/>
+              </w:rPr>
+              <w:t>Cả nhóm</w:t>
+            </w:r>
           </w:p>
         </w:tc>
         <w:tc>
@@ -1628,6 +1577,13 @@
                 <w:szCs w:val="26"/>
               </w:rPr>
             </w:pPr>
+            <w:r>
+              <w:rPr>
+                <w:rFonts w:ascii="Times New Roman" w:hAnsi="Times New Roman" w:cs="Times New Roman"/>
+                <w:sz w:val="26"/>
+              </w:rPr>
+              <w:t>3. Chuẩn bị các file báo cáo đồ án.</w:t>
+            </w:r>
           </w:p>
         </w:tc>
         <w:tc>
@@ -1637,16 +1593,41 @@
               <w:top w:val="dotted" w:sz="4" w:space="0" w:color="auto"/>
               <w:bottom w:val="dotted" w:sz="4" w:space="0" w:color="auto"/>
             </w:tcBorders>
-            <w:vAlign w:val="center"/>
-          </w:tcPr>
-          <w:p>
-            <w:pPr>
-              <w:rPr>
-                <w:rFonts w:ascii="Times New Roman" w:hAnsi="Times New Roman" w:cs="Times New Roman"/>
-                <w:sz w:val="26"/>
-                <w:szCs w:val="26"/>
-              </w:rPr>
-            </w:pPr>
+          </w:tcPr>
+          <w:p>
+            <w:pPr>
+              <w:rPr>
+                <w:rFonts w:ascii="Times New Roman" w:hAnsi="Times New Roman" w:cs="Times New Roman"/>
+                <w:sz w:val="26"/>
+                <w:szCs w:val="26"/>
+              </w:rPr>
+            </w:pPr>
+          </w:p>
+          <w:p>
+            <w:pPr>
+              <w:rPr>
+                <w:rFonts w:ascii="Times New Roman" w:hAnsi="Times New Roman" w:cs="Times New Roman"/>
+                <w:sz w:val="26"/>
+                <w:szCs w:val="26"/>
+              </w:rPr>
+            </w:pPr>
+          </w:p>
+          <w:p>
+            <w:pPr>
+              <w:rPr>
+                <w:rFonts w:ascii="Times New Roman" w:hAnsi="Times New Roman" w:cs="Times New Roman"/>
+                <w:sz w:val="26"/>
+                <w:szCs w:val="26"/>
+              </w:rPr>
+            </w:pPr>
+            <w:r>
+              <w:rPr>
+                <w:rFonts w:ascii="Times New Roman" w:hAnsi="Times New Roman" w:cs="Times New Roman"/>
+                <w:sz w:val="26"/>
+                <w:szCs w:val="26"/>
+              </w:rPr>
+              <w:t>Cả nhóm</w:t>
+            </w:r>
           </w:p>
         </w:tc>
         <w:tc>
@@ -1665,6 +1646,16 @@
                 <w:szCs w:val="26"/>
               </w:rPr>
             </w:pPr>
+            <w:r>
+              <w:rPr>
+                <w:rFonts w:ascii="Times New Roman" w:hAnsi="Times New Roman" w:cs="Times New Roman"/>
+                <w:i/>
+                <w:color w:val="FF0000"/>
+                <w:sz w:val="26"/>
+                <w:szCs w:val="26"/>
+              </w:rPr>
+              <w:t>Họp nhóm 20h ngày 13/08 để báo cáo nội dung đã tìm hiểu được.</w:t>
+            </w:r>
           </w:p>
         </w:tc>
       </w:tr>
@@ -1706,6 +1697,27 @@
                 <w:szCs w:val="26"/>
               </w:rPr>
             </w:pPr>
+            <w:r>
+              <w:rPr>
+                <w:rFonts w:ascii="Times New Roman" w:hAnsi="Times New Roman" w:cs="Times New Roman"/>
+                <w:sz w:val="26"/>
+              </w:rPr>
+              <w:t xml:space="preserve">4. </w:t>
+            </w:r>
+            <w:r>
+              <w:rPr>
+                <w:rFonts w:ascii="Times New Roman" w:hAnsi="Times New Roman" w:cs="Times New Roman"/>
+                <w:sz w:val="26"/>
+              </w:rPr>
+              <w:t xml:space="preserve">Tổng hợp </w:t>
+            </w:r>
+            <w:r>
+              <w:rPr>
+                <w:rFonts w:ascii="Times New Roman" w:hAnsi="Times New Roman" w:cs="Times New Roman"/>
+                <w:sz w:val="26"/>
+              </w:rPr>
+              <w:t>yêu cầu của ứng dụng</w:t>
+            </w:r>
           </w:p>
         </w:tc>
         <w:tc>
@@ -1725,6 +1737,14 @@
                 <w:szCs w:val="26"/>
               </w:rPr>
             </w:pPr>
+            <w:r>
+              <w:rPr>
+                <w:rFonts w:ascii="Times New Roman" w:hAnsi="Times New Roman" w:cs="Times New Roman"/>
+                <w:sz w:val="26"/>
+                <w:szCs w:val="26"/>
+              </w:rPr>
+              <w:t>Trần Thu Ngân</w:t>
+            </w:r>
           </w:p>
         </w:tc>
         <w:tc>
@@ -1784,6 +1804,20 @@
                 <w:szCs w:val="26"/>
               </w:rPr>
             </w:pPr>
+            <w:r>
+              <w:rPr>
+                <w:rFonts w:ascii="Times New Roman" w:hAnsi="Times New Roman" w:cs="Times New Roman"/>
+                <w:sz w:val="26"/>
+              </w:rPr>
+              <w:t xml:space="preserve">5. </w:t>
+            </w:r>
+            <w:r>
+              <w:rPr>
+                <w:rFonts w:ascii="Times New Roman" w:hAnsi="Times New Roman" w:cs="Times New Roman"/>
+                <w:sz w:val="26"/>
+              </w:rPr>
+              <w:t>Kiểm tra các lỗi sai trong quá trình tổng hợp</w:t>
+            </w:r>
           </w:p>
         </w:tc>
         <w:tc>
@@ -1803,6 +1837,14 @@
                 <w:szCs w:val="26"/>
               </w:rPr>
             </w:pPr>
+            <w:r>
+              <w:rPr>
+                <w:rFonts w:ascii="Times New Roman" w:hAnsi="Times New Roman" w:cs="Times New Roman"/>
+                <w:sz w:val="26"/>
+                <w:szCs w:val="26"/>
+              </w:rPr>
+              <w:t>Cả nhóm</w:t>
+            </w:r>
           </w:p>
         </w:tc>
         <w:tc>
@@ -1821,6 +1863,46 @@
                 <w:szCs w:val="26"/>
               </w:rPr>
             </w:pPr>
+            <w:r>
+              <w:rPr>
+                <w:rFonts w:ascii="Times New Roman" w:hAnsi="Times New Roman" w:cs="Times New Roman"/>
+                <w:i/>
+                <w:color w:val="FF0000"/>
+                <w:sz w:val="26"/>
+                <w:szCs w:val="26"/>
+              </w:rPr>
+              <w:t>Họp nhóm 20h ngày 1</w:t>
+            </w:r>
+            <w:r>
+              <w:rPr>
+                <w:rFonts w:ascii="Times New Roman" w:hAnsi="Times New Roman" w:cs="Times New Roman"/>
+                <w:i/>
+                <w:color w:val="FF0000"/>
+                <w:sz w:val="26"/>
+                <w:szCs w:val="26"/>
+              </w:rPr>
+              <w:t>6</w:t>
+            </w:r>
+            <w:r>
+              <w:rPr>
+                <w:rFonts w:ascii="Times New Roman" w:hAnsi="Times New Roman" w:cs="Times New Roman"/>
+                <w:i/>
+                <w:color w:val="FF0000"/>
+                <w:sz w:val="26"/>
+                <w:szCs w:val="26"/>
+              </w:rPr>
+              <w:t>/08 để báo cáo nội dun</w:t>
+            </w:r>
+            <w:r>
+              <w:rPr>
+                <w:rFonts w:ascii="Times New Roman" w:hAnsi="Times New Roman" w:cs="Times New Roman"/>
+                <w:i/>
+                <w:color w:val="FF0000"/>
+                <w:sz w:val="26"/>
+                <w:szCs w:val="26"/>
+              </w:rPr>
+              <w:t>g sau khi phân tích yêu cầu của đồ án</w:t>
+            </w:r>
           </w:p>
         </w:tc>
       </w:tr>
@@ -1882,63 +1964,24 @@
                 <w:sz w:val="26"/>
                 <w:szCs w:val="26"/>
               </w:rPr>
-              <w:t xml:space="preserve">:  </w:t>
-            </w:r>
-            <w:r>
-              <w:rPr>
-                <w:rFonts w:ascii="Times New Roman" w:hAnsi="Times New Roman" w:cs="Times New Roman"/>
-                <w:sz w:val="26"/>
-                <w:szCs w:val="26"/>
-              </w:rPr>
-              <w:t>24</w:t>
-            </w:r>
-            <w:r>
-              <w:rPr>
-                <w:rFonts w:ascii="Times New Roman" w:hAnsi="Times New Roman" w:cs="Times New Roman"/>
-                <w:sz w:val="26"/>
-                <w:szCs w:val="26"/>
-              </w:rPr>
-              <w:t>/</w:t>
-            </w:r>
-            <w:r>
-              <w:rPr>
-                <w:rFonts w:ascii="Times New Roman" w:hAnsi="Times New Roman" w:cs="Times New Roman"/>
-                <w:sz w:val="26"/>
-                <w:szCs w:val="26"/>
-              </w:rPr>
-              <w:t>08</w:t>
-            </w:r>
-            <w:r>
-              <w:rPr>
-                <w:rFonts w:ascii="Times New Roman" w:hAnsi="Times New Roman" w:cs="Times New Roman"/>
-                <w:sz w:val="26"/>
-                <w:szCs w:val="26"/>
-              </w:rPr>
-              <w:t>/20</w:t>
-            </w:r>
-            <w:r>
-              <w:rPr>
-                <w:rFonts w:ascii="Times New Roman" w:hAnsi="Times New Roman" w:cs="Times New Roman"/>
-                <w:sz w:val="26"/>
-                <w:szCs w:val="26"/>
-              </w:rPr>
-              <w:t>26</w:t>
-            </w:r>
-          </w:p>
-          <w:p>
-            <w:pPr>
-              <w:rPr>
-                <w:rFonts w:ascii="Times New Roman" w:hAnsi="Times New Roman" w:cs="Times New Roman"/>
-                <w:sz w:val="26"/>
-                <w:szCs w:val="26"/>
-              </w:rPr>
-            </w:pPr>
-            <w:r>
-              <w:rPr>
-                <w:rFonts w:ascii="Times New Roman" w:hAnsi="Times New Roman" w:cs="Times New Roman"/>
-                <w:sz w:val="26"/>
-                <w:szCs w:val="26"/>
-              </w:rPr>
+              <w:t>:  17/08/2026</w:t>
+            </w:r>
+          </w:p>
+          <w:p>
+            <w:pPr>
+              <w:rPr>
+                <w:rFonts w:ascii="Times New Roman" w:hAnsi="Times New Roman" w:cs="Times New Roman"/>
+                <w:sz w:val="26"/>
+                <w:szCs w:val="26"/>
+              </w:rPr>
+            </w:pPr>
+            <w:r>
+              <w:rPr>
+                <w:rFonts w:ascii="Times New Roman" w:hAnsi="Times New Roman" w:cs="Times New Roman"/>
+                <w:sz w:val="26"/>
+                <w:szCs w:val="26"/>
+              </w:rPr>
+              <w:lastRenderedPageBreak/>
               <w:t xml:space="preserve">Đến:  </w:t>
             </w:r>
             <w:r>
@@ -1947,48 +1990,25 @@
                 <w:sz w:val="26"/>
                 <w:szCs w:val="26"/>
               </w:rPr>
-              <w:t>30</w:t>
-            </w:r>
-            <w:r>
-              <w:rPr>
-                <w:rFonts w:ascii="Times New Roman" w:hAnsi="Times New Roman" w:cs="Times New Roman"/>
-                <w:sz w:val="26"/>
-                <w:szCs w:val="26"/>
-              </w:rPr>
-              <w:t>/</w:t>
-            </w:r>
-            <w:r>
-              <w:rPr>
-                <w:rFonts w:ascii="Times New Roman" w:hAnsi="Times New Roman" w:cs="Times New Roman"/>
-                <w:sz w:val="26"/>
-                <w:szCs w:val="26"/>
-              </w:rPr>
-              <w:t>08</w:t>
-            </w:r>
-            <w:r>
-              <w:rPr>
-                <w:rFonts w:ascii="Times New Roman" w:hAnsi="Times New Roman" w:cs="Times New Roman"/>
-                <w:sz w:val="26"/>
-                <w:szCs w:val="26"/>
-              </w:rPr>
-              <w:t>/20</w:t>
-            </w:r>
-            <w:r>
-              <w:rPr>
-                <w:rFonts w:ascii="Times New Roman" w:hAnsi="Times New Roman" w:cs="Times New Roman"/>
-                <w:sz w:val="26"/>
-                <w:szCs w:val="26"/>
-              </w:rPr>
-              <w:t>26</w:t>
-            </w:r>
-            <w:r>
-              <w:rPr>
-                <w:rFonts w:ascii="Times New Roman" w:hAnsi="Times New Roman" w:cs="Times New Roman"/>
-                <w:sz w:val="26"/>
-                <w:szCs w:val="26"/>
-              </w:rPr>
-              <w:t>)</w:t>
-            </w:r>
+              <w:t>23/08/2026</w:t>
+            </w:r>
+            <w:r>
+              <w:rPr>
+                <w:rFonts w:ascii="Times New Roman" w:hAnsi="Times New Roman" w:cs="Times New Roman"/>
+                <w:sz w:val="26"/>
+                <w:szCs w:val="26"/>
+              </w:rPr>
+              <w:t xml:space="preserve">) </w:t>
+            </w:r>
+          </w:p>
+          <w:p>
+            <w:pPr>
+              <w:rPr>
+                <w:rFonts w:ascii="Times New Roman" w:hAnsi="Times New Roman" w:cs="Times New Roman"/>
+                <w:sz w:val="26"/>
+                <w:szCs w:val="26"/>
+              </w:rPr>
+            </w:pPr>
           </w:p>
         </w:tc>
         <w:tc>
@@ -2415,47 +2435,7 @@
                 <w:sz w:val="26"/>
                 <w:szCs w:val="26"/>
               </w:rPr>
-              <w:t xml:space="preserve">: </w:t>
-            </w:r>
-            <w:r>
-              <w:rPr>
-                <w:rFonts w:ascii="Times New Roman" w:hAnsi="Times New Roman" w:cs="Times New Roman"/>
-                <w:sz w:val="26"/>
-                <w:szCs w:val="26"/>
-              </w:rPr>
-              <w:t>31</w:t>
-            </w:r>
-            <w:r>
-              <w:rPr>
-                <w:rFonts w:ascii="Times New Roman" w:hAnsi="Times New Roman" w:cs="Times New Roman"/>
-                <w:sz w:val="26"/>
-                <w:szCs w:val="26"/>
-              </w:rPr>
-              <w:t>/</w:t>
-            </w:r>
-            <w:r>
-              <w:rPr>
-                <w:rFonts w:ascii="Times New Roman" w:hAnsi="Times New Roman" w:cs="Times New Roman"/>
-                <w:sz w:val="26"/>
-                <w:szCs w:val="26"/>
-              </w:rPr>
-              <w:t>08</w:t>
-            </w:r>
-            <w:r>
-              <w:rPr>
-                <w:rFonts w:ascii="Times New Roman" w:hAnsi="Times New Roman" w:cs="Times New Roman"/>
-                <w:sz w:val="26"/>
-                <w:szCs w:val="26"/>
-              </w:rPr>
-              <w:t>/20</w:t>
-            </w:r>
-            <w:r>
-              <w:rPr>
-                <w:rFonts w:ascii="Times New Roman" w:hAnsi="Times New Roman" w:cs="Times New Roman"/>
-                <w:sz w:val="26"/>
-                <w:szCs w:val="26"/>
-              </w:rPr>
-              <w:t>26</w:t>
+              <w:t>:  24/08/2026</w:t>
             </w:r>
           </w:p>
           <w:p>
@@ -2480,48 +2460,25 @@
                 <w:sz w:val="26"/>
                 <w:szCs w:val="26"/>
               </w:rPr>
-              <w:t>06</w:t>
-            </w:r>
-            <w:r>
-              <w:rPr>
-                <w:rFonts w:ascii="Times New Roman" w:hAnsi="Times New Roman" w:cs="Times New Roman"/>
-                <w:sz w:val="26"/>
-                <w:szCs w:val="26"/>
-              </w:rPr>
-              <w:t>/</w:t>
-            </w:r>
-            <w:r>
-              <w:rPr>
-                <w:rFonts w:ascii="Times New Roman" w:hAnsi="Times New Roman" w:cs="Times New Roman"/>
-                <w:sz w:val="26"/>
-                <w:szCs w:val="26"/>
-              </w:rPr>
-              <w:t>09</w:t>
-            </w:r>
-            <w:r>
-              <w:rPr>
-                <w:rFonts w:ascii="Times New Roman" w:hAnsi="Times New Roman" w:cs="Times New Roman"/>
-                <w:sz w:val="26"/>
-                <w:szCs w:val="26"/>
-              </w:rPr>
-              <w:t>/20</w:t>
-            </w:r>
-            <w:r>
-              <w:rPr>
-                <w:rFonts w:ascii="Times New Roman" w:hAnsi="Times New Roman" w:cs="Times New Roman"/>
-                <w:sz w:val="26"/>
-                <w:szCs w:val="26"/>
-              </w:rPr>
-              <w:t>26</w:t>
-            </w:r>
-            <w:r>
-              <w:rPr>
-                <w:rFonts w:ascii="Times New Roman" w:hAnsi="Times New Roman" w:cs="Times New Roman"/>
-                <w:sz w:val="26"/>
-                <w:szCs w:val="26"/>
-              </w:rPr>
-              <w:t>)</w:t>
-            </w:r>
+              <w:t>30/08/2026</w:t>
+            </w:r>
+            <w:r>
+              <w:rPr>
+                <w:rFonts w:ascii="Times New Roman" w:hAnsi="Times New Roman" w:cs="Times New Roman"/>
+                <w:sz w:val="26"/>
+                <w:szCs w:val="26"/>
+              </w:rPr>
+              <w:t xml:space="preserve">) </w:t>
+            </w:r>
+          </w:p>
+          <w:p>
+            <w:pPr>
+              <w:rPr>
+                <w:rFonts w:ascii="Times New Roman" w:hAnsi="Times New Roman" w:cs="Times New Roman"/>
+                <w:sz w:val="26"/>
+                <w:szCs w:val="26"/>
+              </w:rPr>
+            </w:pPr>
           </w:p>
         </w:tc>
         <w:tc>
@@ -2948,47 +2905,7 @@
                 <w:sz w:val="26"/>
                 <w:szCs w:val="26"/>
               </w:rPr>
-              <w:t xml:space="preserve">:  </w:t>
-            </w:r>
-            <w:r>
-              <w:rPr>
-                <w:rFonts w:ascii="Times New Roman" w:hAnsi="Times New Roman" w:cs="Times New Roman"/>
-                <w:sz w:val="26"/>
-                <w:szCs w:val="26"/>
-              </w:rPr>
-              <w:t>07</w:t>
-            </w:r>
-            <w:r>
-              <w:rPr>
-                <w:rFonts w:ascii="Times New Roman" w:hAnsi="Times New Roman" w:cs="Times New Roman"/>
-                <w:sz w:val="26"/>
-                <w:szCs w:val="26"/>
-              </w:rPr>
-              <w:t>/</w:t>
-            </w:r>
-            <w:r>
-              <w:rPr>
-                <w:rFonts w:ascii="Times New Roman" w:hAnsi="Times New Roman" w:cs="Times New Roman"/>
-                <w:sz w:val="26"/>
-                <w:szCs w:val="26"/>
-              </w:rPr>
-              <w:t>09</w:t>
-            </w:r>
-            <w:r>
-              <w:rPr>
-                <w:rFonts w:ascii="Times New Roman" w:hAnsi="Times New Roman" w:cs="Times New Roman"/>
-                <w:sz w:val="26"/>
-                <w:szCs w:val="26"/>
-              </w:rPr>
-              <w:t>/20</w:t>
-            </w:r>
-            <w:r>
-              <w:rPr>
-                <w:rFonts w:ascii="Times New Roman" w:hAnsi="Times New Roman" w:cs="Times New Roman"/>
-                <w:sz w:val="26"/>
-                <w:szCs w:val="26"/>
-              </w:rPr>
-              <w:t>26</w:t>
+              <w:t>: 31/08/2026</w:t>
             </w:r>
           </w:p>
           <w:p>
@@ -3013,48 +2930,25 @@
                 <w:sz w:val="26"/>
                 <w:szCs w:val="26"/>
               </w:rPr>
-              <w:t>13</w:t>
-            </w:r>
-            <w:r>
-              <w:rPr>
-                <w:rFonts w:ascii="Times New Roman" w:hAnsi="Times New Roman" w:cs="Times New Roman"/>
-                <w:sz w:val="26"/>
-                <w:szCs w:val="26"/>
-              </w:rPr>
-              <w:t>/</w:t>
-            </w:r>
-            <w:r>
-              <w:rPr>
-                <w:rFonts w:ascii="Times New Roman" w:hAnsi="Times New Roman" w:cs="Times New Roman"/>
-                <w:sz w:val="26"/>
-                <w:szCs w:val="26"/>
-              </w:rPr>
-              <w:t>09</w:t>
-            </w:r>
-            <w:r>
-              <w:rPr>
-                <w:rFonts w:ascii="Times New Roman" w:hAnsi="Times New Roman" w:cs="Times New Roman"/>
-                <w:sz w:val="26"/>
-                <w:szCs w:val="26"/>
-              </w:rPr>
-              <w:t>/20</w:t>
-            </w:r>
-            <w:r>
-              <w:rPr>
-                <w:rFonts w:ascii="Times New Roman" w:hAnsi="Times New Roman" w:cs="Times New Roman"/>
-                <w:sz w:val="26"/>
-                <w:szCs w:val="26"/>
-              </w:rPr>
-              <w:t>26</w:t>
-            </w:r>
-            <w:r>
-              <w:rPr>
-                <w:rFonts w:ascii="Times New Roman" w:hAnsi="Times New Roman" w:cs="Times New Roman"/>
-                <w:sz w:val="26"/>
-                <w:szCs w:val="26"/>
-              </w:rPr>
-              <w:t>)</w:t>
-            </w:r>
+              <w:t>06/09/2026</w:t>
+            </w:r>
+            <w:r>
+              <w:rPr>
+                <w:rFonts w:ascii="Times New Roman" w:hAnsi="Times New Roman" w:cs="Times New Roman"/>
+                <w:sz w:val="26"/>
+                <w:szCs w:val="26"/>
+              </w:rPr>
+              <w:t xml:space="preserve">) </w:t>
+            </w:r>
+          </w:p>
+          <w:p>
+            <w:pPr>
+              <w:rPr>
+                <w:rFonts w:ascii="Times New Roman" w:hAnsi="Times New Roman" w:cs="Times New Roman"/>
+                <w:sz w:val="26"/>
+                <w:szCs w:val="26"/>
+              </w:rPr>
+            </w:pPr>
           </w:p>
         </w:tc>
         <w:tc>
@@ -3559,47 +3453,7 @@
                 <w:sz w:val="26"/>
                 <w:szCs w:val="26"/>
               </w:rPr>
-              <w:t xml:space="preserve">:  </w:t>
-            </w:r>
-            <w:r>
-              <w:rPr>
-                <w:rFonts w:ascii="Times New Roman" w:hAnsi="Times New Roman" w:cs="Times New Roman"/>
-                <w:sz w:val="26"/>
-                <w:szCs w:val="26"/>
-              </w:rPr>
-              <w:t>14</w:t>
-            </w:r>
-            <w:r>
-              <w:rPr>
-                <w:rFonts w:ascii="Times New Roman" w:hAnsi="Times New Roman" w:cs="Times New Roman"/>
-                <w:sz w:val="26"/>
-                <w:szCs w:val="26"/>
-              </w:rPr>
-              <w:t>/</w:t>
-            </w:r>
-            <w:r>
-              <w:rPr>
-                <w:rFonts w:ascii="Times New Roman" w:hAnsi="Times New Roman" w:cs="Times New Roman"/>
-                <w:sz w:val="26"/>
-                <w:szCs w:val="26"/>
-              </w:rPr>
-              <w:t>09</w:t>
-            </w:r>
-            <w:r>
-              <w:rPr>
-                <w:rFonts w:ascii="Times New Roman" w:hAnsi="Times New Roman" w:cs="Times New Roman"/>
-                <w:sz w:val="26"/>
-                <w:szCs w:val="26"/>
-              </w:rPr>
-              <w:t>/20</w:t>
-            </w:r>
-            <w:r>
-              <w:rPr>
-                <w:rFonts w:ascii="Times New Roman" w:hAnsi="Times New Roman" w:cs="Times New Roman"/>
-                <w:sz w:val="26"/>
-                <w:szCs w:val="26"/>
-              </w:rPr>
-              <w:t>26</w:t>
+              <w:t>:  07/09/2026</w:t>
             </w:r>
           </w:p>
           <w:p>
@@ -3624,48 +3478,25 @@
                 <w:sz w:val="26"/>
                 <w:szCs w:val="26"/>
               </w:rPr>
-              <w:t>20</w:t>
-            </w:r>
-            <w:r>
-              <w:rPr>
-                <w:rFonts w:ascii="Times New Roman" w:hAnsi="Times New Roman" w:cs="Times New Roman"/>
-                <w:sz w:val="26"/>
-                <w:szCs w:val="26"/>
-              </w:rPr>
-              <w:t>/</w:t>
-            </w:r>
-            <w:r>
-              <w:rPr>
-                <w:rFonts w:ascii="Times New Roman" w:hAnsi="Times New Roman" w:cs="Times New Roman"/>
-                <w:sz w:val="26"/>
-                <w:szCs w:val="26"/>
-              </w:rPr>
-              <w:t>09</w:t>
-            </w:r>
-            <w:r>
-              <w:rPr>
-                <w:rFonts w:ascii="Times New Roman" w:hAnsi="Times New Roman" w:cs="Times New Roman"/>
-                <w:sz w:val="26"/>
-                <w:szCs w:val="26"/>
-              </w:rPr>
-              <w:t>/20</w:t>
-            </w:r>
-            <w:r>
-              <w:rPr>
-                <w:rFonts w:ascii="Times New Roman" w:hAnsi="Times New Roman" w:cs="Times New Roman"/>
-                <w:sz w:val="26"/>
-                <w:szCs w:val="26"/>
-              </w:rPr>
-              <w:t>26</w:t>
-            </w:r>
-            <w:r>
-              <w:rPr>
-                <w:rFonts w:ascii="Times New Roman" w:hAnsi="Times New Roman" w:cs="Times New Roman"/>
-                <w:sz w:val="26"/>
-                <w:szCs w:val="26"/>
-              </w:rPr>
-              <w:t>)</w:t>
-            </w:r>
+              <w:t>13/09/2026</w:t>
+            </w:r>
+            <w:r>
+              <w:rPr>
+                <w:rFonts w:ascii="Times New Roman" w:hAnsi="Times New Roman" w:cs="Times New Roman"/>
+                <w:sz w:val="26"/>
+                <w:szCs w:val="26"/>
+              </w:rPr>
+              <w:t xml:space="preserve">) </w:t>
+            </w:r>
+          </w:p>
+          <w:p>
+            <w:pPr>
+              <w:rPr>
+                <w:rFonts w:ascii="Times New Roman" w:hAnsi="Times New Roman" w:cs="Times New Roman"/>
+                <w:sz w:val="26"/>
+                <w:szCs w:val="26"/>
+              </w:rPr>
+            </w:pPr>
           </w:p>
         </w:tc>
         <w:tc>
@@ -4089,47 +3920,7 @@
                 <w:sz w:val="26"/>
                 <w:szCs w:val="26"/>
               </w:rPr>
-              <w:t xml:space="preserve">:  </w:t>
-            </w:r>
-            <w:r>
-              <w:rPr>
-                <w:rFonts w:ascii="Times New Roman" w:hAnsi="Times New Roman" w:cs="Times New Roman"/>
-                <w:sz w:val="26"/>
-                <w:szCs w:val="26"/>
-              </w:rPr>
-              <w:t>21</w:t>
-            </w:r>
-            <w:r>
-              <w:rPr>
-                <w:rFonts w:ascii="Times New Roman" w:hAnsi="Times New Roman" w:cs="Times New Roman"/>
-                <w:sz w:val="26"/>
-                <w:szCs w:val="26"/>
-              </w:rPr>
-              <w:t>/</w:t>
-            </w:r>
-            <w:r>
-              <w:rPr>
-                <w:rFonts w:ascii="Times New Roman" w:hAnsi="Times New Roman" w:cs="Times New Roman"/>
-                <w:sz w:val="26"/>
-                <w:szCs w:val="26"/>
-              </w:rPr>
-              <w:t>09</w:t>
-            </w:r>
-            <w:r>
-              <w:rPr>
-                <w:rFonts w:ascii="Times New Roman" w:hAnsi="Times New Roman" w:cs="Times New Roman"/>
-                <w:sz w:val="26"/>
-                <w:szCs w:val="26"/>
-              </w:rPr>
-              <w:t>/20</w:t>
-            </w:r>
-            <w:r>
-              <w:rPr>
-                <w:rFonts w:ascii="Times New Roman" w:hAnsi="Times New Roman" w:cs="Times New Roman"/>
-                <w:sz w:val="26"/>
-                <w:szCs w:val="26"/>
-              </w:rPr>
-              <w:t>26</w:t>
+              <w:t>:  14/09/2026</w:t>
             </w:r>
           </w:p>
           <w:p>
@@ -4154,48 +3945,25 @@
                 <w:sz w:val="26"/>
                 <w:szCs w:val="26"/>
               </w:rPr>
-              <w:t>27</w:t>
-            </w:r>
-            <w:r>
-              <w:rPr>
-                <w:rFonts w:ascii="Times New Roman" w:hAnsi="Times New Roman" w:cs="Times New Roman"/>
-                <w:sz w:val="26"/>
-                <w:szCs w:val="26"/>
-              </w:rPr>
-              <w:t>/</w:t>
-            </w:r>
-            <w:r>
-              <w:rPr>
-                <w:rFonts w:ascii="Times New Roman" w:hAnsi="Times New Roman" w:cs="Times New Roman"/>
-                <w:sz w:val="26"/>
-                <w:szCs w:val="26"/>
-              </w:rPr>
-              <w:t>09</w:t>
-            </w:r>
-            <w:r>
-              <w:rPr>
-                <w:rFonts w:ascii="Times New Roman" w:hAnsi="Times New Roman" w:cs="Times New Roman"/>
-                <w:sz w:val="26"/>
-                <w:szCs w:val="26"/>
-              </w:rPr>
-              <w:t>/20</w:t>
-            </w:r>
-            <w:r>
-              <w:rPr>
-                <w:rFonts w:ascii="Times New Roman" w:hAnsi="Times New Roman" w:cs="Times New Roman"/>
-                <w:sz w:val="26"/>
-                <w:szCs w:val="26"/>
-              </w:rPr>
-              <w:t>26</w:t>
-            </w:r>
-            <w:r>
-              <w:rPr>
-                <w:rFonts w:ascii="Times New Roman" w:hAnsi="Times New Roman" w:cs="Times New Roman"/>
-                <w:sz w:val="26"/>
-                <w:szCs w:val="26"/>
-              </w:rPr>
-              <w:t>)</w:t>
-            </w:r>
+              <w:t>20/09/2026</w:t>
+            </w:r>
+            <w:r>
+              <w:rPr>
+                <w:rFonts w:ascii="Times New Roman" w:hAnsi="Times New Roman" w:cs="Times New Roman"/>
+                <w:sz w:val="26"/>
+                <w:szCs w:val="26"/>
+              </w:rPr>
+              <w:t xml:space="preserve">) </w:t>
+            </w:r>
+          </w:p>
+          <w:p>
+            <w:pPr>
+              <w:rPr>
+                <w:rFonts w:ascii="Times New Roman" w:hAnsi="Times New Roman" w:cs="Times New Roman"/>
+                <w:sz w:val="26"/>
+                <w:szCs w:val="26"/>
+              </w:rPr>
+            </w:pPr>
           </w:p>
         </w:tc>
         <w:tc>
@@ -4622,47 +4390,7 @@
                 <w:sz w:val="26"/>
                 <w:szCs w:val="26"/>
               </w:rPr>
-              <w:t xml:space="preserve">:  </w:t>
-            </w:r>
-            <w:r>
-              <w:rPr>
-                <w:rFonts w:ascii="Times New Roman" w:hAnsi="Times New Roman" w:cs="Times New Roman"/>
-                <w:sz w:val="26"/>
-                <w:szCs w:val="26"/>
-              </w:rPr>
-              <w:t>28</w:t>
-            </w:r>
-            <w:r>
-              <w:rPr>
-                <w:rFonts w:ascii="Times New Roman" w:hAnsi="Times New Roman" w:cs="Times New Roman"/>
-                <w:sz w:val="26"/>
-                <w:szCs w:val="26"/>
-              </w:rPr>
-              <w:t>/</w:t>
-            </w:r>
-            <w:r>
-              <w:rPr>
-                <w:rFonts w:ascii="Times New Roman" w:hAnsi="Times New Roman" w:cs="Times New Roman"/>
-                <w:sz w:val="26"/>
-                <w:szCs w:val="26"/>
-              </w:rPr>
-              <w:t>09</w:t>
-            </w:r>
-            <w:r>
-              <w:rPr>
-                <w:rFonts w:ascii="Times New Roman" w:hAnsi="Times New Roman" w:cs="Times New Roman"/>
-                <w:sz w:val="26"/>
-                <w:szCs w:val="26"/>
-              </w:rPr>
-              <w:t>/20</w:t>
-            </w:r>
-            <w:r>
-              <w:rPr>
-                <w:rFonts w:ascii="Times New Roman" w:hAnsi="Times New Roman" w:cs="Times New Roman"/>
-                <w:sz w:val="26"/>
-                <w:szCs w:val="26"/>
-              </w:rPr>
-              <w:t>26</w:t>
+              <w:t>:  21/09/2026</w:t>
             </w:r>
           </w:p>
           <w:p>
@@ -4687,48 +4415,25 @@
                 <w:sz w:val="26"/>
                 <w:szCs w:val="26"/>
               </w:rPr>
-              <w:t>04</w:t>
-            </w:r>
-            <w:r>
-              <w:rPr>
-                <w:rFonts w:ascii="Times New Roman" w:hAnsi="Times New Roman" w:cs="Times New Roman"/>
-                <w:sz w:val="26"/>
-                <w:szCs w:val="26"/>
-              </w:rPr>
-              <w:t>/</w:t>
-            </w:r>
-            <w:r>
-              <w:rPr>
-                <w:rFonts w:ascii="Times New Roman" w:hAnsi="Times New Roman" w:cs="Times New Roman"/>
-                <w:sz w:val="26"/>
-                <w:szCs w:val="26"/>
-              </w:rPr>
-              <w:t>10</w:t>
-            </w:r>
-            <w:r>
-              <w:rPr>
-                <w:rFonts w:ascii="Times New Roman" w:hAnsi="Times New Roman" w:cs="Times New Roman"/>
-                <w:sz w:val="26"/>
-                <w:szCs w:val="26"/>
-              </w:rPr>
-              <w:t>/20</w:t>
-            </w:r>
-            <w:r>
-              <w:rPr>
-                <w:rFonts w:ascii="Times New Roman" w:hAnsi="Times New Roman" w:cs="Times New Roman"/>
-                <w:sz w:val="26"/>
-                <w:szCs w:val="26"/>
-              </w:rPr>
-              <w:t>26</w:t>
-            </w:r>
-            <w:r>
-              <w:rPr>
-                <w:rFonts w:ascii="Times New Roman" w:hAnsi="Times New Roman" w:cs="Times New Roman"/>
-                <w:sz w:val="26"/>
-                <w:szCs w:val="26"/>
-              </w:rPr>
-              <w:t>)</w:t>
-            </w:r>
+              <w:t>27/09/2026</w:t>
+            </w:r>
+            <w:r>
+              <w:rPr>
+                <w:rFonts w:ascii="Times New Roman" w:hAnsi="Times New Roman" w:cs="Times New Roman"/>
+                <w:sz w:val="26"/>
+                <w:szCs w:val="26"/>
+              </w:rPr>
+              <w:t xml:space="preserve">) </w:t>
+            </w:r>
+          </w:p>
+          <w:p>
+            <w:pPr>
+              <w:rPr>
+                <w:rFonts w:ascii="Times New Roman" w:hAnsi="Times New Roman" w:cs="Times New Roman"/>
+                <w:sz w:val="26"/>
+                <w:szCs w:val="26"/>
+              </w:rPr>
+            </w:pPr>
           </w:p>
         </w:tc>
         <w:tc>
@@ -5155,47 +4860,7 @@
                 <w:sz w:val="26"/>
                 <w:szCs w:val="26"/>
               </w:rPr>
-              <w:t xml:space="preserve">:  </w:t>
-            </w:r>
-            <w:r>
-              <w:rPr>
-                <w:rFonts w:ascii="Times New Roman" w:hAnsi="Times New Roman" w:cs="Times New Roman"/>
-                <w:sz w:val="26"/>
-                <w:szCs w:val="26"/>
-              </w:rPr>
-              <w:t>05</w:t>
-            </w:r>
-            <w:r>
-              <w:rPr>
-                <w:rFonts w:ascii="Times New Roman" w:hAnsi="Times New Roman" w:cs="Times New Roman"/>
-                <w:sz w:val="26"/>
-                <w:szCs w:val="26"/>
-              </w:rPr>
-              <w:t>/</w:t>
-            </w:r>
-            <w:r>
-              <w:rPr>
-                <w:rFonts w:ascii="Times New Roman" w:hAnsi="Times New Roman" w:cs="Times New Roman"/>
-                <w:sz w:val="26"/>
-                <w:szCs w:val="26"/>
-              </w:rPr>
-              <w:t>10</w:t>
-            </w:r>
-            <w:r>
-              <w:rPr>
-                <w:rFonts w:ascii="Times New Roman" w:hAnsi="Times New Roman" w:cs="Times New Roman"/>
-                <w:sz w:val="26"/>
-                <w:szCs w:val="26"/>
-              </w:rPr>
-              <w:t>/20</w:t>
-            </w:r>
-            <w:r>
-              <w:rPr>
-                <w:rFonts w:ascii="Times New Roman" w:hAnsi="Times New Roman" w:cs="Times New Roman"/>
-                <w:sz w:val="26"/>
-                <w:szCs w:val="26"/>
-              </w:rPr>
-              <w:t>26</w:t>
+              <w:t>:  28/09/2026</w:t>
             </w:r>
           </w:p>
           <w:p>
@@ -5220,48 +4885,25 @@
                 <w:sz w:val="26"/>
                 <w:szCs w:val="26"/>
               </w:rPr>
-              <w:t>11</w:t>
-            </w:r>
-            <w:r>
-              <w:rPr>
-                <w:rFonts w:ascii="Times New Roman" w:hAnsi="Times New Roman" w:cs="Times New Roman"/>
-                <w:sz w:val="26"/>
-                <w:szCs w:val="26"/>
-              </w:rPr>
-              <w:t>/</w:t>
-            </w:r>
-            <w:r>
-              <w:rPr>
-                <w:rFonts w:ascii="Times New Roman" w:hAnsi="Times New Roman" w:cs="Times New Roman"/>
-                <w:sz w:val="26"/>
-                <w:szCs w:val="26"/>
-              </w:rPr>
-              <w:t>10</w:t>
-            </w:r>
-            <w:r>
-              <w:rPr>
-                <w:rFonts w:ascii="Times New Roman" w:hAnsi="Times New Roman" w:cs="Times New Roman"/>
-                <w:sz w:val="26"/>
-                <w:szCs w:val="26"/>
-              </w:rPr>
-              <w:t>/20</w:t>
-            </w:r>
-            <w:r>
-              <w:rPr>
-                <w:rFonts w:ascii="Times New Roman" w:hAnsi="Times New Roman" w:cs="Times New Roman"/>
-                <w:sz w:val="26"/>
-                <w:szCs w:val="26"/>
-              </w:rPr>
-              <w:t>26</w:t>
-            </w:r>
-            <w:r>
-              <w:rPr>
-                <w:rFonts w:ascii="Times New Roman" w:hAnsi="Times New Roman" w:cs="Times New Roman"/>
-                <w:sz w:val="26"/>
-                <w:szCs w:val="26"/>
-              </w:rPr>
-              <w:t>)</w:t>
-            </w:r>
+              <w:t>04/10/2026</w:t>
+            </w:r>
+            <w:r>
+              <w:rPr>
+                <w:rFonts w:ascii="Times New Roman" w:hAnsi="Times New Roman" w:cs="Times New Roman"/>
+                <w:sz w:val="26"/>
+                <w:szCs w:val="26"/>
+              </w:rPr>
+              <w:t xml:space="preserve">) </w:t>
+            </w:r>
+          </w:p>
+          <w:p>
+            <w:pPr>
+              <w:rPr>
+                <w:rFonts w:ascii="Times New Roman" w:hAnsi="Times New Roman" w:cs="Times New Roman"/>
+                <w:sz w:val="26"/>
+                <w:szCs w:val="26"/>
+              </w:rPr>
+            </w:pPr>
           </w:p>
         </w:tc>
         <w:tc>
@@ -5688,63 +5330,24 @@
                 <w:sz w:val="26"/>
                 <w:szCs w:val="26"/>
               </w:rPr>
-              <w:t xml:space="preserve">:  </w:t>
-            </w:r>
-            <w:r>
-              <w:rPr>
-                <w:rFonts w:ascii="Times New Roman" w:hAnsi="Times New Roman" w:cs="Times New Roman"/>
-                <w:sz w:val="26"/>
-                <w:szCs w:val="26"/>
-              </w:rPr>
-              <w:t>12</w:t>
-            </w:r>
-            <w:r>
-              <w:rPr>
-                <w:rFonts w:ascii="Times New Roman" w:hAnsi="Times New Roman" w:cs="Times New Roman"/>
-                <w:sz w:val="26"/>
-                <w:szCs w:val="26"/>
-              </w:rPr>
-              <w:t>/</w:t>
-            </w:r>
-            <w:r>
-              <w:rPr>
-                <w:rFonts w:ascii="Times New Roman" w:hAnsi="Times New Roman" w:cs="Times New Roman"/>
-                <w:sz w:val="26"/>
-                <w:szCs w:val="26"/>
-              </w:rPr>
-              <w:t>10</w:t>
-            </w:r>
-            <w:r>
-              <w:rPr>
-                <w:rFonts w:ascii="Times New Roman" w:hAnsi="Times New Roman" w:cs="Times New Roman"/>
-                <w:sz w:val="26"/>
-                <w:szCs w:val="26"/>
-              </w:rPr>
-              <w:t>/20</w:t>
-            </w:r>
-            <w:r>
-              <w:rPr>
-                <w:rFonts w:ascii="Times New Roman" w:hAnsi="Times New Roman" w:cs="Times New Roman"/>
-                <w:sz w:val="26"/>
-                <w:szCs w:val="26"/>
-              </w:rPr>
-              <w:t>26</w:t>
-            </w:r>
-          </w:p>
-          <w:p>
-            <w:pPr>
-              <w:rPr>
-                <w:rFonts w:ascii="Times New Roman" w:hAnsi="Times New Roman" w:cs="Times New Roman"/>
-                <w:sz w:val="26"/>
-                <w:szCs w:val="26"/>
-              </w:rPr>
-            </w:pPr>
-            <w:r>
-              <w:rPr>
-                <w:rFonts w:ascii="Times New Roman" w:hAnsi="Times New Roman" w:cs="Times New Roman"/>
-                <w:sz w:val="26"/>
-                <w:szCs w:val="26"/>
-              </w:rPr>
+              <w:t>:  05/10/2026</w:t>
+            </w:r>
+          </w:p>
+          <w:p>
+            <w:pPr>
+              <w:rPr>
+                <w:rFonts w:ascii="Times New Roman" w:hAnsi="Times New Roman" w:cs="Times New Roman"/>
+                <w:sz w:val="26"/>
+                <w:szCs w:val="26"/>
+              </w:rPr>
+            </w:pPr>
+            <w:r>
+              <w:rPr>
+                <w:rFonts w:ascii="Times New Roman" w:hAnsi="Times New Roman" w:cs="Times New Roman"/>
+                <w:sz w:val="26"/>
+                <w:szCs w:val="26"/>
+              </w:rPr>
+              <w:lastRenderedPageBreak/>
               <w:t xml:space="preserve">Đến:  </w:t>
             </w:r>
             <w:r>
@@ -5753,48 +5356,25 @@
                 <w:sz w:val="26"/>
                 <w:szCs w:val="26"/>
               </w:rPr>
-              <w:t>18</w:t>
-            </w:r>
-            <w:r>
-              <w:rPr>
-                <w:rFonts w:ascii="Times New Roman" w:hAnsi="Times New Roman" w:cs="Times New Roman"/>
-                <w:sz w:val="26"/>
-                <w:szCs w:val="26"/>
-              </w:rPr>
-              <w:t>/</w:t>
-            </w:r>
-            <w:r>
-              <w:rPr>
-                <w:rFonts w:ascii="Times New Roman" w:hAnsi="Times New Roman" w:cs="Times New Roman"/>
-                <w:sz w:val="26"/>
-                <w:szCs w:val="26"/>
-              </w:rPr>
-              <w:t>10</w:t>
-            </w:r>
-            <w:r>
-              <w:rPr>
-                <w:rFonts w:ascii="Times New Roman" w:hAnsi="Times New Roman" w:cs="Times New Roman"/>
-                <w:sz w:val="26"/>
-                <w:szCs w:val="26"/>
-              </w:rPr>
-              <w:t>/20</w:t>
-            </w:r>
-            <w:r>
-              <w:rPr>
-                <w:rFonts w:ascii="Times New Roman" w:hAnsi="Times New Roman" w:cs="Times New Roman"/>
-                <w:sz w:val="26"/>
-                <w:szCs w:val="26"/>
-              </w:rPr>
-              <w:t>26</w:t>
-            </w:r>
-            <w:r>
-              <w:rPr>
-                <w:rFonts w:ascii="Times New Roman" w:hAnsi="Times New Roman" w:cs="Times New Roman"/>
-                <w:sz w:val="26"/>
-                <w:szCs w:val="26"/>
-              </w:rPr>
-              <w:t>)</w:t>
-            </w:r>
+              <w:t>11/10/2026</w:t>
+            </w:r>
+            <w:r>
+              <w:rPr>
+                <w:rFonts w:ascii="Times New Roman" w:hAnsi="Times New Roman" w:cs="Times New Roman"/>
+                <w:sz w:val="26"/>
+                <w:szCs w:val="26"/>
+              </w:rPr>
+              <w:t xml:space="preserve">) </w:t>
+            </w:r>
+          </w:p>
+          <w:p>
+            <w:pPr>
+              <w:rPr>
+                <w:rFonts w:ascii="Times New Roman" w:hAnsi="Times New Roman" w:cs="Times New Roman"/>
+                <w:sz w:val="26"/>
+                <w:szCs w:val="26"/>
+              </w:rPr>
+            </w:pPr>
           </w:p>
         </w:tc>
         <w:tc>
@@ -6214,7 +5794,7 @@
                 <w:sz w:val="26"/>
                 <w:szCs w:val="26"/>
               </w:rPr>
-              <w:t>:  ../../2018</w:t>
+              <w:t>:  12/10/2026</w:t>
             </w:r>
           </w:p>
           <w:p>
@@ -6239,16 +5819,25 @@
                 <w:sz w:val="26"/>
                 <w:szCs w:val="26"/>
               </w:rPr>
-              <w:t>../../2018</w:t>
-            </w:r>
-            <w:r>
-              <w:rPr>
-                <w:rFonts w:ascii="Times New Roman" w:hAnsi="Times New Roman" w:cs="Times New Roman"/>
-                <w:sz w:val="26"/>
-                <w:szCs w:val="26"/>
-              </w:rPr>
-              <w:t>)</w:t>
-            </w:r>
+              <w:t>18/10/2026</w:t>
+            </w:r>
+            <w:r>
+              <w:rPr>
+                <w:rFonts w:ascii="Times New Roman" w:hAnsi="Times New Roman" w:cs="Times New Roman"/>
+                <w:sz w:val="26"/>
+                <w:szCs w:val="26"/>
+              </w:rPr>
+              <w:t xml:space="preserve">) </w:t>
+            </w:r>
+          </w:p>
+          <w:p>
+            <w:pPr>
+              <w:rPr>
+                <w:rFonts w:ascii="Times New Roman" w:hAnsi="Times New Roman" w:cs="Times New Roman"/>
+                <w:sz w:val="26"/>
+                <w:szCs w:val="26"/>
+              </w:rPr>
+            </w:pPr>
           </w:p>
         </w:tc>
         <w:tc>
@@ -7163,7 +6752,6 @@
                 <w:sz w:val="26"/>
                 <w:szCs w:val="26"/>
               </w:rPr>
-              <w:lastRenderedPageBreak/>
               <w:t xml:space="preserve">Đến:  </w:t>
             </w:r>
             <w:r>
@@ -8598,7 +8186,7 @@
         </w:rPr>
         <w:t xml:space="preserve">: </w:t>
       </w:r>
-      <w:hyperlink r:id="rId7" w:history="1">
+      <w:hyperlink r:id="rId8" w:history="1">
         <w:r>
           <w:rPr>
             <w:rStyle w:val="Hyperlink"/>
@@ -8663,7 +8251,7 @@
       </w:r>
     </w:p>
     <w:sectPr>
-      <w:footerReference w:type="default" r:id="rId8"/>
+      <w:footerReference w:type="default" r:id="rId9"/>
       <w:pgSz w:w="12240" w:h="15840" w:code="1"/>
       <w:pgMar w:top="851" w:right="851" w:bottom="851" w:left="1134" w:header="567" w:footer="567" w:gutter="0"/>
       <w:cols w:space="720"/>
@@ -9498,6 +9086,7 @@
   <w:style w:type="paragraph" w:default="1" w:styleId="Normal">
     <w:name w:val="Normal"/>
     <w:qFormat/>
+    <w:rsid w:val="00BE19E7"/>
   </w:style>
   <w:style w:type="character" w:default="1" w:styleId="DefaultParagraphFont">
     <w:name w:val="Default Paragraph Font"/>

</xml_diff>